<commit_message>
Continue the anonymous ctf
</commit_message>
<xml_diff>
--- a/THM_challenges/Medium/Anonymous/Anonymous_Solution_Documentation.docx
+++ b/THM_challenges/Medium/Anonymous/Anonymous_Solution_Documentation.docx
@@ -781,6 +781,7 @@
       </w:pPr>
       <w:r>
         <w:rPr>
+          <w:noProof/>
           <w:sz w:val="24"/>
           <w:szCs w:val="24"/>
         </w:rPr>
@@ -845,6 +846,7 @@
       </w:pPr>
       <w:r>
         <w:rPr>
+          <w:noProof/>
           <w:sz w:val="24"/>
           <w:szCs w:val="24"/>
         </w:rPr>
@@ -1039,6 +1041,70 @@
           <w:sz w:val="24"/>
           <w:szCs w:val="24"/>
         </w:rPr>
+        <w:t>I transformed this shell to full TTY using this command:</w:t>
+      </w:r>
+    </w:p>
+    <w:p>
+      <w:pPr>
+        <w:rPr>
+          <w:sz w:val="24"/>
+          <w:szCs w:val="24"/>
+        </w:rPr>
+      </w:pPr>
+      <w:r>
+        <w:rPr>
+          <w:sz w:val="24"/>
+          <w:szCs w:val="24"/>
+        </w:rPr>
+        <w:drawing>
+          <wp:inline distT="0" distB="0" distL="0" distR="0" wp14:anchorId="2B69348D" wp14:editId="7E11D0AC">
+            <wp:extent cx="4038950" cy="140982"/>
+            <wp:effectExtent l="0" t="0" r="0" b="0"/>
+            <wp:docPr id="639037032" name="תמונה 1"/>
+            <wp:cNvGraphicFramePr>
+              <a:graphicFrameLocks xmlns:a="http://schemas.openxmlformats.org/drawingml/2006/main" noChangeAspect="1"/>
+            </wp:cNvGraphicFramePr>
+            <a:graphic xmlns:a="http://schemas.openxmlformats.org/drawingml/2006/main">
+              <a:graphicData uri="http://schemas.openxmlformats.org/drawingml/2006/picture">
+                <pic:pic xmlns:pic="http://schemas.openxmlformats.org/drawingml/2006/picture">
+                  <pic:nvPicPr>
+                    <pic:cNvPr id="639037032" name=""/>
+                    <pic:cNvPicPr/>
+                  </pic:nvPicPr>
+                  <pic:blipFill>
+                    <a:blip r:embed="rId16"/>
+                    <a:stretch>
+                      <a:fillRect/>
+                    </a:stretch>
+                  </pic:blipFill>
+                  <pic:spPr>
+                    <a:xfrm>
+                      <a:off x="0" y="0"/>
+                      <a:ext cx="4038950" cy="140982"/>
+                    </a:xfrm>
+                    <a:prstGeom prst="rect">
+                      <a:avLst/>
+                    </a:prstGeom>
+                  </pic:spPr>
+                </pic:pic>
+              </a:graphicData>
+            </a:graphic>
+          </wp:inline>
+        </w:drawing>
+      </w:r>
+    </w:p>
+    <w:p>
+      <w:pPr>
+        <w:rPr>
+          <w:sz w:val="24"/>
+          <w:szCs w:val="24"/>
+        </w:rPr>
+      </w:pPr>
+      <w:r>
+        <w:rPr>
+          <w:sz w:val="24"/>
+          <w:szCs w:val="24"/>
+        </w:rPr>
         <w:t>And there I found the user.txt file</w:t>
       </w:r>
       <w:r>
@@ -1065,6 +1131,7 @@
       </w:pPr>
       <w:r>
         <w:rPr>
+          <w:noProof/>
           <w:sz w:val="24"/>
           <w:szCs w:val="24"/>
         </w:rPr>
@@ -1084,7 +1151,7 @@
                     <pic:cNvPicPr/>
                   </pic:nvPicPr>
                   <pic:blipFill>
-                    <a:blip r:embed="rId16"/>
+                    <a:blip r:embed="rId17"/>
                     <a:stretch>
                       <a:fillRect/>
                     </a:stretch>
@@ -1112,6 +1179,271 @@
           <w:szCs w:val="24"/>
         </w:rPr>
       </w:pPr>
+      <w:r>
+        <w:rPr>
+          <w:sz w:val="24"/>
+          <w:szCs w:val="24"/>
+        </w:rPr>
+        <w:t xml:space="preserve">Then, I continued this challenge by searching for </w:t>
+      </w:r>
+      <w:r>
+        <w:rPr>
+          <w:sz w:val="24"/>
+          <w:szCs w:val="24"/>
+        </w:rPr>
+        <w:t xml:space="preserve">a </w:t>
+      </w:r>
+      <w:r>
+        <w:rPr>
+          <w:sz w:val="24"/>
+          <w:szCs w:val="24"/>
+        </w:rPr>
+        <w:t>way to escalate my privileges</w:t>
+      </w:r>
+      <w:r>
+        <w:rPr>
+          <w:sz w:val="24"/>
+          <w:szCs w:val="24"/>
+        </w:rPr>
+        <w:t xml:space="preserve">. I </w:t>
+      </w:r>
+      <w:r>
+        <w:rPr>
+          <w:sz w:val="24"/>
+          <w:szCs w:val="24"/>
+        </w:rPr>
+        <w:t>found on that same directory, a folder named “pics” which contained these images:</w:t>
+      </w:r>
+    </w:p>
+    <w:p>
+      <w:pPr>
+        <w:rPr>
+          <w:sz w:val="24"/>
+          <w:szCs w:val="24"/>
+        </w:rPr>
+      </w:pPr>
+      <w:r>
+        <w:rPr>
+          <w:sz w:val="24"/>
+          <w:szCs w:val="24"/>
+        </w:rPr>
+        <w:drawing>
+          <wp:inline distT="0" distB="0" distL="0" distR="0" wp14:anchorId="475DB7B3" wp14:editId="715D216B">
+            <wp:extent cx="731583" cy="464860"/>
+            <wp:effectExtent l="0" t="0" r="0" b="0"/>
+            <wp:docPr id="1931839280" name="תמונה 1"/>
+            <wp:cNvGraphicFramePr>
+              <a:graphicFrameLocks xmlns:a="http://schemas.openxmlformats.org/drawingml/2006/main" noChangeAspect="1"/>
+            </wp:cNvGraphicFramePr>
+            <a:graphic xmlns:a="http://schemas.openxmlformats.org/drawingml/2006/main">
+              <a:graphicData uri="http://schemas.openxmlformats.org/drawingml/2006/picture">
+                <pic:pic xmlns:pic="http://schemas.openxmlformats.org/drawingml/2006/picture">
+                  <pic:nvPicPr>
+                    <pic:cNvPr id="1931839280" name=""/>
+                    <pic:cNvPicPr/>
+                  </pic:nvPicPr>
+                  <pic:blipFill>
+                    <a:blip r:embed="rId18"/>
+                    <a:stretch>
+                      <a:fillRect/>
+                    </a:stretch>
+                  </pic:blipFill>
+                  <pic:spPr>
+                    <a:xfrm>
+                      <a:off x="0" y="0"/>
+                      <a:ext cx="731583" cy="464860"/>
+                    </a:xfrm>
+                    <a:prstGeom prst="rect">
+                      <a:avLst/>
+                    </a:prstGeom>
+                  </pic:spPr>
+                </pic:pic>
+              </a:graphicData>
+            </a:graphic>
+          </wp:inline>
+        </w:drawing>
+      </w:r>
+    </w:p>
+    <w:p>
+      <w:pPr>
+        <w:rPr>
+          <w:sz w:val="24"/>
+          <w:szCs w:val="24"/>
+        </w:rPr>
+      </w:pPr>
+      <w:r>
+        <w:rPr>
+          <w:sz w:val="24"/>
+          <w:szCs w:val="24"/>
+        </w:rPr>
+        <w:t>I downloaded them (using a simple python http server) to my machine and opened them:</w:t>
+      </w:r>
+    </w:p>
+    <w:p>
+      <w:pPr>
+        <w:rPr>
+          <w:sz w:val="24"/>
+          <w:szCs w:val="24"/>
+        </w:rPr>
+      </w:pPr>
+    </w:p>
+    <w:p>
+      <w:pPr>
+        <w:rPr>
+          <w:sz w:val="24"/>
+          <w:szCs w:val="24"/>
+        </w:rPr>
+      </w:pPr>
+    </w:p>
+    <w:p>
+      <w:pPr>
+        <w:rPr>
+          <w:sz w:val="24"/>
+          <w:szCs w:val="24"/>
+        </w:rPr>
+      </w:pPr>
+    </w:p>
+    <w:p>
+      <w:pPr>
+        <w:rPr>
+          <w:b/>
+          <w:bCs/>
+          <w:sz w:val="24"/>
+          <w:szCs w:val="24"/>
+          <w:u w:val="single"/>
+        </w:rPr>
+      </w:pPr>
+      <w:r>
+        <w:rPr>
+          <w:b/>
+          <w:bCs/>
+          <w:sz w:val="24"/>
+          <w:szCs w:val="24"/>
+          <w:u w:val="single"/>
+        </w:rPr>
+        <w:t>corgo2.jpg:</w:t>
+      </w:r>
+    </w:p>
+    <w:p>
+      <w:pPr>
+        <w:rPr>
+          <w:sz w:val="24"/>
+          <w:szCs w:val="24"/>
+        </w:rPr>
+      </w:pPr>
+      <w:r>
+        <w:rPr>
+          <w:noProof/>
+        </w:rPr>
+        <w:drawing>
+          <wp:inline distT="0" distB="0" distL="0" distR="0" wp14:anchorId="6EC40B17" wp14:editId="0CFCDC1D">
+            <wp:extent cx="2459182" cy="1638468"/>
+            <wp:effectExtent l="0" t="0" r="0" b="0"/>
+            <wp:docPr id="683307380" name="תמונה 1"/>
+            <wp:cNvGraphicFramePr>
+              <a:graphicFrameLocks xmlns:a="http://schemas.openxmlformats.org/drawingml/2006/main" noChangeAspect="1"/>
+            </wp:cNvGraphicFramePr>
+            <a:graphic xmlns:a="http://schemas.openxmlformats.org/drawingml/2006/main">
+              <a:graphicData uri="http://schemas.openxmlformats.org/drawingml/2006/picture">
+                <pic:pic xmlns:pic="http://schemas.openxmlformats.org/drawingml/2006/picture">
+                  <pic:nvPicPr>
+                    <pic:cNvPr id="683307380" name=""/>
+                    <pic:cNvPicPr/>
+                  </pic:nvPicPr>
+                  <pic:blipFill>
+                    <a:blip r:embed="rId19"/>
+                    <a:stretch>
+                      <a:fillRect/>
+                    </a:stretch>
+                  </pic:blipFill>
+                  <pic:spPr>
+                    <a:xfrm>
+                      <a:off x="0" y="0"/>
+                      <a:ext cx="2465427" cy="1642629"/>
+                    </a:xfrm>
+                    <a:prstGeom prst="rect">
+                      <a:avLst/>
+                    </a:prstGeom>
+                  </pic:spPr>
+                </pic:pic>
+              </a:graphicData>
+            </a:graphic>
+          </wp:inline>
+        </w:drawing>
+      </w:r>
+    </w:p>
+    <w:p>
+      <w:pPr>
+        <w:rPr>
+          <w:b/>
+          <w:bCs/>
+          <w:sz w:val="24"/>
+          <w:szCs w:val="24"/>
+          <w:u w:val="single"/>
+        </w:rPr>
+      </w:pPr>
+      <w:r>
+        <w:rPr>
+          <w:b/>
+          <w:bCs/>
+          <w:sz w:val="24"/>
+          <w:szCs w:val="24"/>
+          <w:u w:val="single"/>
+        </w:rPr>
+        <w:t>Puppos.jpeg:</w:t>
+      </w:r>
+    </w:p>
+    <w:p>
+      <w:pPr>
+        <w:rPr>
+          <w:sz w:val="24"/>
+          <w:szCs w:val="24"/>
+        </w:rPr>
+      </w:pPr>
+      <w:r>
+        <w:rPr>
+          <w:sz w:val="24"/>
+          <w:szCs w:val="24"/>
+        </w:rPr>
+        <w:t>Empty image</w:t>
+      </w:r>
+    </w:p>
+    <w:p>
+      <w:pPr>
+        <w:rPr>
+          <w:sz w:val="24"/>
+          <w:szCs w:val="24"/>
+        </w:rPr>
+      </w:pPr>
+    </w:p>
+    <w:p>
+      <w:pPr>
+        <w:rPr>
+          <w:sz w:val="24"/>
+          <w:szCs w:val="24"/>
+        </w:rPr>
+      </w:pPr>
+      <w:r>
+        <w:rPr>
+          <w:sz w:val="24"/>
+          <w:szCs w:val="24"/>
+        </w:rPr>
+        <w:t xml:space="preserve">So, after examining these 2 images, I basically </w:t>
+      </w:r>
+      <w:r>
+        <w:rPr>
+          <w:sz w:val="24"/>
+          <w:szCs w:val="24"/>
+        </w:rPr>
+        <w:t xml:space="preserve">understood </w:t>
+      </w:r>
+      <w:r>
+        <w:rPr>
+          <w:sz w:val="24"/>
+          <w:szCs w:val="24"/>
+        </w:rPr>
+        <w:t xml:space="preserve">that </w:t>
+      </w:r>
     </w:p>
     <w:sectPr>
       <w:pgSz w:w="11906" w:h="16838"/>
@@ -1596,10 +1928,10 @@
   <a:themeElements>
     <a:clrScheme name="Office">
       <a:dk1>
-        <a:sysClr val="windowText" lastClr="FFFFFF"/>
+        <a:sysClr val="windowText" lastClr="000000"/>
       </a:dk1>
       <a:lt1>
-        <a:sysClr val="window" lastClr="000000"/>
+        <a:sysClr val="window" lastClr="FFFFFF"/>
       </a:lt1>
       <a:dk2>
         <a:srgbClr val="44546A"/>

</xml_diff>

<commit_message>
Anonymous thm ctf was completed
</commit_message>
<xml_diff>
--- a/THM_challenges/Medium/Anonymous/Anonymous_Solution_Documentation.docx
+++ b/THM_challenges/Medium/Anonymous/Anonymous_Solution_Documentation.docx
@@ -1053,6 +1053,7 @@
       </w:pPr>
       <w:r>
         <w:rPr>
+          <w:noProof/>
           <w:sz w:val="24"/>
           <w:szCs w:val="24"/>
         </w:rPr>
@@ -1224,6 +1225,7 @@
       </w:pPr>
       <w:r>
         <w:rPr>
+          <w:noProof/>
           <w:sz w:val="24"/>
           <w:szCs w:val="24"/>
         </w:rPr>
@@ -1286,6 +1288,97 @@
           <w:szCs w:val="24"/>
         </w:rPr>
       </w:pPr>
+      <w:r>
+        <w:rPr>
+          <w:sz w:val="24"/>
+          <w:szCs w:val="24"/>
+        </w:rPr>
+        <w:drawing>
+          <wp:inline distT="0" distB="0" distL="0" distR="0" wp14:anchorId="1808EF36" wp14:editId="29CDB985">
+            <wp:extent cx="2933954" cy="171465"/>
+            <wp:effectExtent l="0" t="0" r="0" b="0"/>
+            <wp:docPr id="219074122" name="תמונה 1"/>
+            <wp:cNvGraphicFramePr>
+              <a:graphicFrameLocks xmlns:a="http://schemas.openxmlformats.org/drawingml/2006/main" noChangeAspect="1"/>
+            </wp:cNvGraphicFramePr>
+            <a:graphic xmlns:a="http://schemas.openxmlformats.org/drawingml/2006/main">
+              <a:graphicData uri="http://schemas.openxmlformats.org/drawingml/2006/picture">
+                <pic:pic xmlns:pic="http://schemas.openxmlformats.org/drawingml/2006/picture">
+                  <pic:nvPicPr>
+                    <pic:cNvPr id="219074122" name=""/>
+                    <pic:cNvPicPr/>
+                  </pic:nvPicPr>
+                  <pic:blipFill>
+                    <a:blip r:embed="rId19"/>
+                    <a:stretch>
+                      <a:fillRect/>
+                    </a:stretch>
+                  </pic:blipFill>
+                  <pic:spPr>
+                    <a:xfrm>
+                      <a:off x="0" y="0"/>
+                      <a:ext cx="2933954" cy="171465"/>
+                    </a:xfrm>
+                    <a:prstGeom prst="rect">
+                      <a:avLst/>
+                    </a:prstGeom>
+                  </pic:spPr>
+                </pic:pic>
+              </a:graphicData>
+            </a:graphic>
+          </wp:inline>
+        </w:drawing>
+      </w:r>
+    </w:p>
+    <w:p>
+      <w:pPr>
+        <w:rPr>
+          <w:sz w:val="24"/>
+          <w:szCs w:val="24"/>
+        </w:rPr>
+      </w:pPr>
+      <w:r>
+        <w:rPr>
+          <w:sz w:val="24"/>
+          <w:szCs w:val="24"/>
+        </w:rPr>
+        <w:lastRenderedPageBreak/>
+        <w:drawing>
+          <wp:inline distT="0" distB="0" distL="0" distR="0" wp14:anchorId="4F071AF8" wp14:editId="4B399BEB">
+            <wp:extent cx="5274310" cy="1170305"/>
+            <wp:effectExtent l="0" t="0" r="2540" b="0"/>
+            <wp:docPr id="429809655" name="תמונה 1"/>
+            <wp:cNvGraphicFramePr>
+              <a:graphicFrameLocks xmlns:a="http://schemas.openxmlformats.org/drawingml/2006/main" noChangeAspect="1"/>
+            </wp:cNvGraphicFramePr>
+            <a:graphic xmlns:a="http://schemas.openxmlformats.org/drawingml/2006/main">
+              <a:graphicData uri="http://schemas.openxmlformats.org/drawingml/2006/picture">
+                <pic:pic xmlns:pic="http://schemas.openxmlformats.org/drawingml/2006/picture">
+                  <pic:nvPicPr>
+                    <pic:cNvPr id="429809655" name=""/>
+                    <pic:cNvPicPr/>
+                  </pic:nvPicPr>
+                  <pic:blipFill>
+                    <a:blip r:embed="rId20"/>
+                    <a:stretch>
+                      <a:fillRect/>
+                    </a:stretch>
+                  </pic:blipFill>
+                  <pic:spPr>
+                    <a:xfrm>
+                      <a:off x="0" y="0"/>
+                      <a:ext cx="5274310" cy="1170305"/>
+                    </a:xfrm>
+                    <a:prstGeom prst="rect">
+                      <a:avLst/>
+                    </a:prstGeom>
+                  </pic:spPr>
+                </pic:pic>
+              </a:graphicData>
+            </a:graphic>
+          </wp:inline>
+        </w:drawing>
+      </w:r>
     </w:p>
     <w:p>
       <w:pPr>
@@ -1351,7 +1444,7 @@
                     <pic:cNvPicPr/>
                   </pic:nvPicPr>
                   <pic:blipFill>
-                    <a:blip r:embed="rId19"/>
+                    <a:blip r:embed="rId21"/>
                     <a:stretch>
                       <a:fillRect/>
                     </a:stretch>
@@ -1402,48 +1495,394 @@
       </w:pPr>
       <w:r>
         <w:rPr>
-          <w:sz w:val="24"/>
-          <w:szCs w:val="24"/>
-        </w:rPr>
-        <w:t>Empty image</w:t>
-      </w:r>
-    </w:p>
-    <w:p>
-      <w:pPr>
-        <w:rPr>
-          <w:sz w:val="24"/>
-          <w:szCs w:val="24"/>
-        </w:rPr>
-      </w:pPr>
-    </w:p>
-    <w:p>
-      <w:pPr>
-        <w:rPr>
-          <w:sz w:val="24"/>
-          <w:szCs w:val="24"/>
-        </w:rPr>
-      </w:pPr>
-      <w:r>
-        <w:rPr>
-          <w:sz w:val="24"/>
-          <w:szCs w:val="24"/>
-        </w:rPr>
-        <w:t xml:space="preserve">So, after examining these 2 images, I basically </w:t>
-      </w:r>
-      <w:r>
-        <w:rPr>
-          <w:sz w:val="24"/>
-          <w:szCs w:val="24"/>
-        </w:rPr>
-        <w:t xml:space="preserve">understood </w:t>
-      </w:r>
-      <w:r>
-        <w:rPr>
-          <w:sz w:val="24"/>
-          <w:szCs w:val="24"/>
-        </w:rPr>
-        <w:t xml:space="preserve">that </w:t>
-      </w:r>
+          <w:noProof/>
+        </w:rPr>
+        <w:drawing>
+          <wp:inline distT="0" distB="0" distL="0" distR="0" wp14:anchorId="4A9308E5" wp14:editId="69D310DA">
+            <wp:extent cx="2467989" cy="1645227"/>
+            <wp:effectExtent l="0" t="0" r="8890" b="0"/>
+            <wp:docPr id="1028790627" name="תמונה 1"/>
+            <wp:cNvGraphicFramePr>
+              <a:graphicFrameLocks xmlns:a="http://schemas.openxmlformats.org/drawingml/2006/main" noChangeAspect="1"/>
+            </wp:cNvGraphicFramePr>
+            <a:graphic xmlns:a="http://schemas.openxmlformats.org/drawingml/2006/main">
+              <a:graphicData uri="http://schemas.openxmlformats.org/drawingml/2006/picture">
+                <pic:pic xmlns:pic="http://schemas.openxmlformats.org/drawingml/2006/picture">
+                  <pic:nvPicPr>
+                    <pic:cNvPr id="1028790627" name=""/>
+                    <pic:cNvPicPr/>
+                  </pic:nvPicPr>
+                  <pic:blipFill>
+                    <a:blip r:embed="rId22"/>
+                    <a:stretch>
+                      <a:fillRect/>
+                    </a:stretch>
+                  </pic:blipFill>
+                  <pic:spPr>
+                    <a:xfrm>
+                      <a:off x="0" y="0"/>
+                      <a:ext cx="2475244" cy="1650064"/>
+                    </a:xfrm>
+                    <a:prstGeom prst="rect">
+                      <a:avLst/>
+                    </a:prstGeom>
+                  </pic:spPr>
+                </pic:pic>
+              </a:graphicData>
+            </a:graphic>
+          </wp:inline>
+        </w:drawing>
+      </w:r>
+    </w:p>
+    <w:p>
+      <w:pPr>
+        <w:rPr>
+          <w:sz w:val="24"/>
+          <w:szCs w:val="24"/>
+        </w:rPr>
+      </w:pPr>
+    </w:p>
+    <w:p>
+      <w:pPr>
+        <w:rPr>
+          <w:sz w:val="24"/>
+          <w:szCs w:val="24"/>
+        </w:rPr>
+      </w:pPr>
+      <w:r>
+        <w:rPr>
+          <w:sz w:val="24"/>
+          <w:szCs w:val="24"/>
+        </w:rPr>
+        <w:t xml:space="preserve">I </w:t>
+      </w:r>
+      <w:r>
+        <w:rPr>
+          <w:sz w:val="24"/>
+          <w:szCs w:val="24"/>
+        </w:rPr>
+        <w:t>looked at</w:t>
+      </w:r>
+      <w:r>
+        <w:rPr>
+          <w:sz w:val="24"/>
+          <w:szCs w:val="24"/>
+        </w:rPr>
+        <w:t xml:space="preserve"> these images</w:t>
+      </w:r>
+      <w:r>
+        <w:rPr>
+          <w:sz w:val="24"/>
+          <w:szCs w:val="24"/>
+        </w:rPr>
+        <w:t xml:space="preserve"> for several minutes (including investigation </w:t>
+      </w:r>
+      <w:r>
+        <w:rPr>
+          <w:sz w:val="24"/>
+          <w:szCs w:val="24"/>
+        </w:rPr>
+        <w:t>for secret messages inside their content</w:t>
+      </w:r>
+      <w:r>
+        <w:rPr>
+          <w:sz w:val="24"/>
+          <w:szCs w:val="24"/>
+        </w:rPr>
+        <w:t>)</w:t>
+      </w:r>
+      <w:r>
+        <w:rPr>
+          <w:sz w:val="24"/>
+          <w:szCs w:val="24"/>
+        </w:rPr>
+        <w:t xml:space="preserve"> I gave </w:t>
+      </w:r>
+      <w:r>
+        <w:rPr>
+          <w:sz w:val="24"/>
+          <w:szCs w:val="24"/>
+        </w:rPr>
+        <w:t>up and</w:t>
+      </w:r>
+      <w:r>
+        <w:rPr>
+          <w:sz w:val="24"/>
+          <w:szCs w:val="24"/>
+        </w:rPr>
+        <w:t xml:space="preserve"> moved to search for SUID binaries over the target’s machine</w:t>
+      </w:r>
+      <w:r>
+        <w:rPr>
+          <w:sz w:val="24"/>
+          <w:szCs w:val="24"/>
+        </w:rPr>
+        <w:t xml:space="preserve"> using this command:</w:t>
+      </w:r>
+    </w:p>
+    <w:p>
+      <w:pPr>
+        <w:rPr>
+          <w:sz w:val="24"/>
+          <w:szCs w:val="24"/>
+        </w:rPr>
+      </w:pPr>
+      <w:r>
+        <w:rPr>
+          <w:sz w:val="24"/>
+          <w:szCs w:val="24"/>
+        </w:rPr>
+        <w:drawing>
+          <wp:inline distT="0" distB="0" distL="0" distR="0" wp14:anchorId="5B8045E3" wp14:editId="63060BC6">
+            <wp:extent cx="3505504" cy="140982"/>
+            <wp:effectExtent l="0" t="0" r="0" b="0"/>
+            <wp:docPr id="938792797" name="תמונה 1"/>
+            <wp:cNvGraphicFramePr>
+              <a:graphicFrameLocks xmlns:a="http://schemas.openxmlformats.org/drawingml/2006/main" noChangeAspect="1"/>
+            </wp:cNvGraphicFramePr>
+            <a:graphic xmlns:a="http://schemas.openxmlformats.org/drawingml/2006/main">
+              <a:graphicData uri="http://schemas.openxmlformats.org/drawingml/2006/picture">
+                <pic:pic xmlns:pic="http://schemas.openxmlformats.org/drawingml/2006/picture">
+                  <pic:nvPicPr>
+                    <pic:cNvPr id="938792797" name=""/>
+                    <pic:cNvPicPr/>
+                  </pic:nvPicPr>
+                  <pic:blipFill>
+                    <a:blip r:embed="rId23"/>
+                    <a:stretch>
+                      <a:fillRect/>
+                    </a:stretch>
+                  </pic:blipFill>
+                  <pic:spPr>
+                    <a:xfrm>
+                      <a:off x="0" y="0"/>
+                      <a:ext cx="3505504" cy="140982"/>
+                    </a:xfrm>
+                    <a:prstGeom prst="rect">
+                      <a:avLst/>
+                    </a:prstGeom>
+                  </pic:spPr>
+                </pic:pic>
+              </a:graphicData>
+            </a:graphic>
+          </wp:inline>
+        </w:drawing>
+      </w:r>
+    </w:p>
+    <w:p>
+      <w:pPr>
+        <w:rPr>
+          <w:sz w:val="24"/>
+          <w:szCs w:val="24"/>
+        </w:rPr>
+      </w:pPr>
+      <w:r>
+        <w:rPr>
+          <w:sz w:val="24"/>
+          <w:szCs w:val="24"/>
+        </w:rPr>
+        <w:t>I found this unusual binary:</w:t>
+      </w:r>
+    </w:p>
+    <w:p>
+      <w:pPr>
+        <w:rPr>
+          <w:sz w:val="24"/>
+          <w:szCs w:val="24"/>
+        </w:rPr>
+      </w:pPr>
+      <w:r>
+        <w:rPr>
+          <w:sz w:val="24"/>
+          <w:szCs w:val="24"/>
+        </w:rPr>
+        <w:drawing>
+          <wp:inline distT="0" distB="0" distL="0" distR="0" wp14:anchorId="7E1FF596" wp14:editId="2B1D7840">
+            <wp:extent cx="769687" cy="171465"/>
+            <wp:effectExtent l="0" t="0" r="0" b="0"/>
+            <wp:docPr id="1035478604" name="תמונה 1"/>
+            <wp:cNvGraphicFramePr>
+              <a:graphicFrameLocks xmlns:a="http://schemas.openxmlformats.org/drawingml/2006/main" noChangeAspect="1"/>
+            </wp:cNvGraphicFramePr>
+            <a:graphic xmlns:a="http://schemas.openxmlformats.org/drawingml/2006/main">
+              <a:graphicData uri="http://schemas.openxmlformats.org/drawingml/2006/picture">
+                <pic:pic xmlns:pic="http://schemas.openxmlformats.org/drawingml/2006/picture">
+                  <pic:nvPicPr>
+                    <pic:cNvPr id="1035478604" name=""/>
+                    <pic:cNvPicPr/>
+                  </pic:nvPicPr>
+                  <pic:blipFill>
+                    <a:blip r:embed="rId24"/>
+                    <a:stretch>
+                      <a:fillRect/>
+                    </a:stretch>
+                  </pic:blipFill>
+                  <pic:spPr>
+                    <a:xfrm>
+                      <a:off x="0" y="0"/>
+                      <a:ext cx="769687" cy="171465"/>
+                    </a:xfrm>
+                    <a:prstGeom prst="rect">
+                      <a:avLst/>
+                    </a:prstGeom>
+                  </pic:spPr>
+                </pic:pic>
+              </a:graphicData>
+            </a:graphic>
+          </wp:inline>
+        </w:drawing>
+      </w:r>
+    </w:p>
+    <w:p>
+      <w:pPr>
+        <w:rPr>
+          <w:sz w:val="24"/>
+          <w:szCs w:val="24"/>
+          <w:lang w:bidi="he-IL"/>
+        </w:rPr>
+      </w:pPr>
+      <w:r>
+        <w:rPr>
+          <w:sz w:val="24"/>
+          <w:szCs w:val="24"/>
+        </w:rPr>
+        <w:t xml:space="preserve">After checking in </w:t>
+      </w:r>
+      <w:r>
+        <w:rPr>
+          <w:sz w:val="24"/>
+          <w:szCs w:val="24"/>
+        </w:rPr>
+        <w:t>GTFOBins</w:t>
+      </w:r>
+      <w:r>
+        <w:rPr>
+          <w:sz w:val="24"/>
+          <w:szCs w:val="24"/>
+        </w:rPr>
+        <w:t>,</w:t>
+      </w:r>
+      <w:r>
+        <w:rPr>
+          <w:sz w:val="24"/>
+          <w:szCs w:val="24"/>
+        </w:rPr>
+        <w:t xml:space="preserve"> I found that I can use this binary </w:t>
+      </w:r>
+      <w:r>
+        <w:rPr>
+          <w:sz w:val="24"/>
+          <w:szCs w:val="24"/>
+        </w:rPr>
+        <w:t xml:space="preserve">for </w:t>
+      </w:r>
+      <w:r>
+        <w:rPr>
+          <w:sz w:val="24"/>
+          <w:szCs w:val="24"/>
+        </w:rPr>
+        <w:t xml:space="preserve">escalate my privileges </w:t>
+      </w:r>
+      <w:r>
+        <w:rPr>
+          <w:sz w:val="24"/>
+          <w:szCs w:val="24"/>
+        </w:rPr>
+        <w:t xml:space="preserve">by </w:t>
+      </w:r>
+      <w:r>
+        <w:rPr>
+          <w:sz w:val="24"/>
+          <w:szCs w:val="24"/>
+          <w:lang w:bidi="he-IL"/>
+        </w:rPr>
+        <w:t>executing this exploit:</w:t>
+      </w:r>
+    </w:p>
+    <w:p>
+      <w:pPr>
+        <w:rPr>
+          <w:sz w:val="24"/>
+          <w:szCs w:val="24"/>
+          <w:lang w:bidi="he-IL"/>
+        </w:rPr>
+      </w:pPr>
+      <w:r>
+        <w:rPr>
+          <w:sz w:val="24"/>
+          <w:szCs w:val="24"/>
+          <w:lang w:bidi="he-IL"/>
+        </w:rPr>
+        <w:drawing>
+          <wp:inline distT="0" distB="0" distL="0" distR="0" wp14:anchorId="2F231126" wp14:editId="6F55A9F5">
+            <wp:extent cx="2267146" cy="502964"/>
+            <wp:effectExtent l="0" t="0" r="0" b="0"/>
+            <wp:docPr id="1280715926" name="תמונה 1"/>
+            <wp:cNvGraphicFramePr>
+              <a:graphicFrameLocks xmlns:a="http://schemas.openxmlformats.org/drawingml/2006/main" noChangeAspect="1"/>
+            </wp:cNvGraphicFramePr>
+            <a:graphic xmlns:a="http://schemas.openxmlformats.org/drawingml/2006/main">
+              <a:graphicData uri="http://schemas.openxmlformats.org/drawingml/2006/picture">
+                <pic:pic xmlns:pic="http://schemas.openxmlformats.org/drawingml/2006/picture">
+                  <pic:nvPicPr>
+                    <pic:cNvPr id="1280715926" name=""/>
+                    <pic:cNvPicPr/>
+                  </pic:nvPicPr>
+                  <pic:blipFill>
+                    <a:blip r:embed="rId25"/>
+                    <a:stretch>
+                      <a:fillRect/>
+                    </a:stretch>
+                  </pic:blipFill>
+                  <pic:spPr>
+                    <a:xfrm>
+                      <a:off x="0" y="0"/>
+                      <a:ext cx="2267146" cy="502964"/>
+                    </a:xfrm>
+                    <a:prstGeom prst="rect">
+                      <a:avLst/>
+                    </a:prstGeom>
+                  </pic:spPr>
+                </pic:pic>
+              </a:graphicData>
+            </a:graphic>
+          </wp:inline>
+        </w:drawing>
+      </w:r>
+    </w:p>
+    <w:p>
+      <w:pPr>
+        <w:rPr>
+          <w:sz w:val="24"/>
+          <w:szCs w:val="24"/>
+          <w:lang w:bidi="he-IL"/>
+        </w:rPr>
+      </w:pPr>
+      <w:r>
+        <w:rPr>
+          <w:sz w:val="24"/>
+          <w:szCs w:val="24"/>
+          <w:lang w:bidi="he-IL"/>
+        </w:rPr>
+        <w:t>And after short navigation, I found the root.txt file</w:t>
+      </w:r>
+      <w:r>
+        <w:rPr>
+          <w:sz w:val="24"/>
+          <w:szCs w:val="24"/>
+          <w:lang w:bidi="he-IL"/>
+        </w:rPr>
+        <w:t xml:space="preserve"> content inside the /root directory.</w:t>
+      </w:r>
+    </w:p>
+    <w:p>
+      <w:pPr>
+        <w:rPr>
+          <w:sz w:val="24"/>
+          <w:szCs w:val="24"/>
+          <w:lang w:bidi="he-IL"/>
+        </w:rPr>
+      </w:pPr>
     </w:p>
     <w:sectPr>
       <w:pgSz w:w="11906" w:h="16838"/>

</xml_diff>